<commit_message>
Assignment 2: add figure placeholders for EC2 screenshots
Co-Authored-By: Claude Opus 5.5 <noreply@anthropic.com>
</commit_message>
<xml_diff>
--- a/Assignment2_Cloud_Computing_AWS.docx
+++ b/Assignment2_Cloud_Computing_AWS.docx
@@ -1085,125 +1085,251 @@
         <w:rPr>
           <w:b w:val="0"/>
         </w:rPr>
-        <w:t>The expected output at each stage of the EC2 instance lifecycle is shown below.</w:t>
+        <w:t>The following screenshots show the EC2 instance created, configured, connected to and serving a web page.</w:t>
       </w:r>
     </w:p>
+    <w:tbl>
+      <w:tblPr>
+        <w:tblStyle w:val="TableGrid"/>
+        <w:tblW w:type="auto" w:w="0"/>
+        <w:tblLook w:firstColumn="1" w:firstRow="1" w:lastColumn="0" w:lastRow="0" w:noHBand="0" w:noVBand="1" w:val="04A0"/>
+      </w:tblPr>
+      <w:tblGrid>
+        <w:gridCol w:w="9360"/>
+      </w:tblGrid>
+      <w:tr>
+        <w:trPr>
+          <w:trHeight w:val="3685" w:hRule="atLeast"/>
+        </w:trPr>
+        <w:tc>
+          <w:tcPr>
+            <w:tcW w:type="dxa" w:w="9360"/>
+          </w:tcPr>
+          <w:p>
+            <w:pPr>
+              <w:spacing w:before="120"/>
+              <w:jc w:val="center"/>
+            </w:pPr>
+            <w:r>
+              <w:rPr>
+                <w:b/>
+                <w:color w:val="808080"/>
+              </w:rPr>
+              <w:t>[Paste Figure 1 screenshot here]</w:t>
+            </w:r>
+          </w:p>
+          <w:p>
+            <w:pPr>
+              <w:jc w:val="center"/>
+            </w:pPr>
+            <w:r>
+              <w:rPr>
+                <w:i/>
+                <w:color w:val="808080"/>
+                <w:sz w:val="18"/>
+              </w:rPr>
+              <w:t>Must show: EC2 Instances page; instance name devops-assignment-ec2; Instance state: Running; Status checks: 2/2 checks passed; instance type and Availability Zone</w:t>
+            </w:r>
+          </w:p>
+        </w:tc>
+      </w:tr>
+    </w:tbl>
     <w:p>
       <w:pPr>
-        <w:spacing w:after="80" w:before="0"/>
+        <w:spacing w:after="240" w:before="80"/>
+        <w:jc w:val="center"/>
       </w:pPr>
       <w:r>
         <w:rPr>
-          <w:b w:val="0"/>
+          <w:b/>
         </w:rPr>
-        <w:t>Expected result in the terminal after connecting:</w:t>
+        <w:t xml:space="preserve">Figure 1. </w:t>
+      </w:r>
+      <w:r>
+        <w:t>EC2 instance successfully launched and running.</w:t>
       </w:r>
     </w:p>
+    <w:tbl>
+      <w:tblPr>
+        <w:tblStyle w:val="TableGrid"/>
+        <w:tblW w:type="auto" w:w="0"/>
+        <w:tblLook w:firstColumn="1" w:firstRow="1" w:lastColumn="0" w:lastRow="0" w:noHBand="0" w:noVBand="1" w:val="04A0"/>
+      </w:tblPr>
+      <w:tblGrid>
+        <w:gridCol w:w="9360"/>
+      </w:tblGrid>
+      <w:tr>
+        <w:trPr>
+          <w:trHeight w:val="3685" w:hRule="atLeast"/>
+        </w:trPr>
+        <w:tc>
+          <w:tcPr>
+            <w:tcW w:type="dxa" w:w="9360"/>
+          </w:tcPr>
+          <w:p>
+            <w:pPr>
+              <w:spacing w:before="120"/>
+              <w:jc w:val="center"/>
+            </w:pPr>
+            <w:r>
+              <w:rPr>
+                <w:b/>
+                <w:color w:val="808080"/>
+              </w:rPr>
+              <w:t>[Paste Figure 2 screenshot here]</w:t>
+            </w:r>
+          </w:p>
+          <w:p>
+            <w:pPr>
+              <w:jc w:val="center"/>
+            </w:pPr>
+            <w:r>
+              <w:rPr>
+                <w:i/>
+                <w:color w:val="808080"/>
+                <w:sz w:val="18"/>
+              </w:rPr>
+              <w:t>Must show: security group attached to the instance; SSH – TCP 22 – source My IP; HTTP – TCP 80 – source 0.0.0.0/0</w:t>
+            </w:r>
+          </w:p>
+        </w:tc>
+      </w:tr>
+    </w:tbl>
     <w:p>
       <w:pPr>
-        <w:spacing w:after="160"/>
-        <w:ind w:left="144" w:right="144"/>
-        <w:shd w:val="clear" w:color="auto" w:fill="F2F2F2"/>
-        <w:pBdr>
-          <w:top w:val="single" w:sz="4" w:space="4" w:color="BFBFBF"/>
-          <w:left w:val="single" w:sz="4" w:space="4" w:color="BFBFBF"/>
-          <w:bottom w:val="single" w:sz="4" w:space="4" w:color="BFBFBF"/>
-          <w:right w:val="single" w:sz="4" w:space="4" w:color="BFBFBF"/>
-        </w:pBdr>
+        <w:spacing w:after="240" w:before="80"/>
+        <w:jc w:val="center"/>
       </w:pPr>
       <w:r>
         <w:rPr>
-          <w:rFonts w:ascii="Consolas" w:hAnsi="Consolas" w:eastAsia="Consolas"/>
-          <w:sz w:val="18"/>
+          <w:b/>
         </w:rPr>
-        <w:t>[ec2-user@ip-172-31-10-25 ~]$ whoami</w:t>
-        <w:br/>
+        <w:t xml:space="preserve">Figure 2. </w:t>
       </w:r>
       <w:r>
-        <w:rPr>
-          <w:rFonts w:ascii="Consolas" w:hAnsi="Consolas" w:eastAsia="Consolas"/>
-          <w:sz w:val="18"/>
-        </w:rPr>
-        <w:t>ec2-user</w:t>
-        <w:br/>
-      </w:r>
-      <w:r>
-        <w:rPr>
-          <w:rFonts w:ascii="Consolas" w:hAnsi="Consolas" w:eastAsia="Consolas"/>
-          <w:sz w:val="18"/>
-        </w:rPr>
-        <w:t>[ec2-user@ip-172-31-10-25 ~]$ curl localhost</w:t>
-        <w:br/>
-      </w:r>
-      <w:r>
-        <w:rPr>
-          <w:rFonts w:ascii="Consolas" w:hAnsi="Consolas" w:eastAsia="Consolas"/>
-          <w:sz w:val="18"/>
-        </w:rPr>
-        <w:t>&lt;h1&gt;Hello from AWS EC2 - DevOps Assignment 2&lt;/h1&gt;</w:t>
+        <w:t>Security group configured for SSH and HTTP access.</w:t>
       </w:r>
     </w:p>
+    <w:tbl>
+      <w:tblPr>
+        <w:tblStyle w:val="TableGrid"/>
+        <w:tblW w:type="auto" w:w="0"/>
+        <w:tblLook w:firstColumn="1" w:firstRow="1" w:lastColumn="0" w:lastRow="0" w:noHBand="0" w:noVBand="1" w:val="04A0"/>
+      </w:tblPr>
+      <w:tblGrid>
+        <w:gridCol w:w="9360"/>
+      </w:tblGrid>
+      <w:tr>
+        <w:trPr>
+          <w:trHeight w:val="3685" w:hRule="atLeast"/>
+        </w:trPr>
+        <w:tc>
+          <w:tcPr>
+            <w:tcW w:type="dxa" w:w="9360"/>
+          </w:tcPr>
+          <w:p>
+            <w:pPr>
+              <w:spacing w:before="120"/>
+              <w:jc w:val="center"/>
+            </w:pPr>
+            <w:r>
+              <w:rPr>
+                <w:b/>
+                <w:color w:val="808080"/>
+              </w:rPr>
+              <w:t>[Paste Figure 3 screenshot here]</w:t>
+            </w:r>
+          </w:p>
+          <w:p>
+            <w:pPr>
+              <w:jc w:val="center"/>
+            </w:pPr>
+            <w:r>
+              <w:rPr>
+                <w:i/>
+                <w:color w:val="808080"/>
+                <w:sz w:val="18"/>
+              </w:rPr>
+              <w:t>Must show: SSH command / connected session; whoami → ec2-user; uname -a or cat /etc/os-release; sudo systemctl status httpd (if it fits)</w:t>
+            </w:r>
+          </w:p>
+        </w:tc>
+      </w:tr>
+    </w:tbl>
     <w:p>
       <w:pPr>
-        <w:spacing w:after="80" w:before="0"/>
+        <w:spacing w:after="240" w:before="80"/>
+        <w:jc w:val="center"/>
       </w:pPr>
       <w:r>
         <w:rPr>
-          <w:b w:val="0"/>
+          <w:b/>
         </w:rPr>
-        <w:t>Opening http://&lt;PUBLIC_IP&gt; in a browser displays the web page served by the instance.</w:t>
+        <w:t xml:space="preserve">Figure 3. </w:t>
+      </w:r>
+      <w:r>
+        <w:t>Secure connection to the EC2 instance and verification of the server.</w:t>
       </w:r>
     </w:p>
+    <w:tbl>
+      <w:tblPr>
+        <w:tblStyle w:val="TableGrid"/>
+        <w:tblW w:type="auto" w:w="0"/>
+        <w:tblLook w:firstColumn="1" w:firstRow="1" w:lastColumn="0" w:lastRow="0" w:noHBand="0" w:noVBand="1" w:val="04A0"/>
+      </w:tblPr>
+      <w:tblGrid>
+        <w:gridCol w:w="9360"/>
+      </w:tblGrid>
+      <w:tr>
+        <w:trPr>
+          <w:trHeight w:val="3685" w:hRule="atLeast"/>
+        </w:trPr>
+        <w:tc>
+          <w:tcPr>
+            <w:tcW w:type="dxa" w:w="9360"/>
+          </w:tcPr>
+          <w:p>
+            <w:pPr>
+              <w:spacing w:before="120"/>
+              <w:jc w:val="center"/>
+            </w:pPr>
+            <w:r>
+              <w:rPr>
+                <w:b/>
+                <w:color w:val="808080"/>
+              </w:rPr>
+              <w:t>[Paste Figure 4 screenshot here]</w:t>
+            </w:r>
+          </w:p>
+          <w:p>
+            <w:pPr>
+              <w:jc w:val="center"/>
+            </w:pPr>
+            <w:r>
+              <w:rPr>
+                <w:i/>
+                <w:color w:val="808080"/>
+                <w:sz w:val="18"/>
+              </w:rPr>
+              <w:t>Must show: public IP in the browser address bar; page text: Hello from AWS EC2 - DevOps Assignment 2</w:t>
+            </w:r>
+          </w:p>
+        </w:tc>
+      </w:tr>
+    </w:tbl>
     <w:p>
       <w:pPr>
-        <w:spacing w:after="160"/>
-        <w:ind w:left="144" w:right="144"/>
-        <w:shd w:val="clear" w:color="auto" w:fill="F2F2F2"/>
-        <w:pBdr>
-          <w:top w:val="single" w:sz="4" w:space="4" w:color="BFBFBF"/>
-          <w:left w:val="single" w:sz="4" w:space="4" w:color="BFBFBF"/>
-          <w:bottom w:val="single" w:sz="4" w:space="4" w:color="BFBFBF"/>
-          <w:right w:val="single" w:sz="4" w:space="4" w:color="BFBFBF"/>
-        </w:pBdr>
+        <w:spacing w:after="240" w:before="80"/>
+        <w:jc w:val="center"/>
       </w:pPr>
       <w:r>
         <w:rPr>
-          <w:rFonts w:ascii="Consolas" w:hAnsi="Consolas" w:eastAsia="Consolas"/>
-          <w:sz w:val="18"/>
+          <w:b/>
         </w:rPr>
-        <w:t>$ aws ec2 terminate-instances --instance-ids i-0abc123def4567890</w:t>
-        <w:br/>
+        <w:t xml:space="preserve">Figure 4. </w:t>
       </w:r>
       <w:r>
-        <w:rPr>
-          <w:rFonts w:ascii="Consolas" w:hAnsi="Consolas" w:eastAsia="Consolas"/>
-          <w:sz w:val="18"/>
-        </w:rPr>
-        <w:t>TerminatingInstances:</w:t>
-        <w:br/>
-      </w:r>
-      <w:r>
-        <w:rPr>
-          <w:rFonts w:ascii="Consolas" w:hAnsi="Consolas" w:eastAsia="Consolas"/>
-          <w:sz w:val="18"/>
-        </w:rPr>
-        <w:t>- CurrentState: {Code: 32, Name: shutting-down}</w:t>
-        <w:br/>
-      </w:r>
-      <w:r>
-        <w:rPr>
-          <w:rFonts w:ascii="Consolas" w:hAnsi="Consolas" w:eastAsia="Consolas"/>
-          <w:sz w:val="18"/>
-        </w:rPr>
-        <w:t xml:space="preserve">  InstanceId: i-0abc123def4567890</w:t>
-        <w:br/>
-      </w:r>
-      <w:r>
-        <w:rPr>
-          <w:rFonts w:ascii="Consolas" w:hAnsi="Consolas" w:eastAsia="Consolas"/>
-          <w:sz w:val="18"/>
-        </w:rPr>
-        <w:t xml:space="preserve">  PreviousState: {Code: 16, Name: running}</w:t>
+        <w:t>Web page hosted on the EC2 instance.</w:t>
       </w:r>
     </w:p>
     <w:p>

</xml_diff>